<commit_message>
Updated Week 2 report to include data dictionary progress
</commit_message>
<xml_diff>
--- a/reports/week2_report.docx
+++ b/reports/week2_report.docx
@@ -53,7 +53,7 @@
         <w:pStyle w:val="Date"/>
       </w:pPr>
       <w:r>
-        <w:t xml:space="preserve">2026-04-29</w:t>
+        <w:t xml:space="preserve">2026-05-01</w:t>
       </w:r>
     </w:p>
     <w:bookmarkStart w:id="20" w:name="name"/>
@@ -586,6 +586,117 @@
       </w:r>
     </w:p>
     <w:p>
+      <w:pPr>
+        <w:pStyle w:val="BodyText"/>
+      </w:pPr>
+      <w:r>
+        <w:t xml:space="preserve">• Updated the data dictionary utility script (</w:t>
+      </w:r>
+      <w:r>
+        <w:rPr>
+          <w:rStyle w:val="VerbatimChar"/>
+        </w:rPr>
+        <w:t xml:space="preserve">utils_dictionary.R</w:t>
+      </w:r>
+      <w:r>
+        <w:t xml:space="preserve">) to</w:t>
+      </w:r>
+      <w:r>
+        <w:t xml:space="preserve"> </w:t>
+      </w:r>
+      <w:r>
+        <w:t xml:space="preserve">generate documentation for the cleaned dataset, including variable</w:t>
+      </w:r>
+      <w:r>
+        <w:t xml:space="preserve"> </w:t>
+      </w:r>
+      <w:r>
+        <w:t xml:space="preserve">names, data types, missing counts, missing percentages, descriptions,</w:t>
+      </w:r>
+      <w:r>
+        <w:t xml:space="preserve"> </w:t>
+      </w:r>
+      <w:r>
+        <w:t xml:space="preserve">and notes</w:t>
+      </w:r>
+    </w:p>
+    <w:p>
+      <w:pPr>
+        <w:pStyle w:val="BodyText"/>
+      </w:pPr>
+      <w:r>
+        <w:t xml:space="preserve">• Corrected the data dictionary descriptions and notes to ensure they</w:t>
+      </w:r>
+      <w:r>
+        <w:t xml:space="preserve"> </w:t>
+      </w:r>
+      <w:r>
+        <w:t xml:space="preserve">align with the cleaned dataset, particularly for</w:t>
+      </w:r>
+      <w:r>
+        <w:t xml:space="preserve"> </w:t>
+      </w:r>
+      <w:r>
+        <w:rPr>
+          <w:rStyle w:val="VerbatimChar"/>
+        </w:rPr>
+        <w:t xml:space="preserve">price_per_unit</w:t>
+      </w:r>
+      <w:r>
+        <w:t xml:space="preserve">,</w:t>
+      </w:r>
+      <w:r>
+        <w:t xml:space="preserve"> </w:t>
+      </w:r>
+      <w:r>
+        <w:rPr>
+          <w:rStyle w:val="VerbatimChar"/>
+        </w:rPr>
+        <w:t xml:space="preserve">quantity</w:t>
+      </w:r>
+      <w:r>
+        <w:t xml:space="preserve">, and</w:t>
+      </w:r>
+      <w:r>
+        <w:t xml:space="preserve"> </w:t>
+      </w:r>
+      <w:r>
+        <w:rPr>
+          <w:rStyle w:val="VerbatimChar"/>
+        </w:rPr>
+        <w:t xml:space="preserve">total_spent</w:t>
+      </w:r>
+    </w:p>
+    <w:p>
+      <w:pPr>
+        <w:pStyle w:val="BodyText"/>
+      </w:pPr>
+      <w:r>
+        <w:t xml:space="preserve">• Integrated the data dictionary utility into</w:t>
+      </w:r>
+      <w:r>
+        <w:t xml:space="preserve"> </w:t>
+      </w:r>
+      <w:r>
+        <w:rPr>
+          <w:rStyle w:val="VerbatimChar"/>
+        </w:rPr>
+        <w:t xml:space="preserve">run_pipeline.R</w:t>
+      </w:r>
+      <w:r>
+        <w:t xml:space="preserve"> </w:t>
+      </w:r>
+      <w:r>
+        <w:t xml:space="preserve">so that</w:t>
+      </w:r>
+      <w:r>
+        <w:t xml:space="preserve"> </w:t>
+      </w:r>
+      <w:r>
+        <w:t xml:space="preserve">the data dictionary is generated as part of the pipeline execution</w:t>
+      </w:r>
+    </w:p>
+    <w:p>
       <w:r>
         <w:pict>
           <v:rect style="width:0;height:1.5pt" o:hralign="center" o:hrstd="t" o:hr="t"/>
@@ -658,13 +769,13 @@
         <w:pStyle w:val="BodyText"/>
       </w:pPr>
       <w:r>
-        <w:t xml:space="preserve">• Prepare cleaned datasets for export into multiple formats (SPSS,</w:t>
-      </w:r>
-      <w:r>
-        <w:t xml:space="preserve"> </w:t>
-      </w:r>
-      <w:r>
-        <w:t xml:space="preserve">Stata, Excel, RDS)</w:t>
+        <w:t xml:space="preserve">• Prepare cleaned datasets and the completed data dictionary for export</w:t>
+      </w:r>
+      <w:r>
+        <w:t xml:space="preserve"> </w:t>
+      </w:r>
+      <w:r>
+        <w:t xml:space="preserve">into multiple formats (SPSS, Stata, Excel, RDS)</w:t>
       </w:r>
     </w:p>
     <w:p>

</xml_diff>